<commit_message>
docs: complete audit report LiVrai CRM
</commit_message>
<xml_diff>
--- a/Documentation/rapport_audit_livrai.docx
+++ b/Documentation/rapport_audit_livrai.docx
@@ -366,7 +366,7 @@
               <w:rPr>
                 <w:noProof/>
               </w:rPr>
-              <w:t>3</w:t>
+              <w:t>4</w:t>
             </w:r>
             <w:r>
               <w:rPr>
@@ -427,7 +427,7 @@
               <w:rPr>
                 <w:noProof/>
               </w:rPr>
-              <w:t>4</w:t>
+              <w:t>5</w:t>
             </w:r>
             <w:r>
               <w:rPr>
@@ -488,7 +488,7 @@
               <w:rPr>
                 <w:noProof/>
               </w:rPr>
-              <w:t>4</w:t>
+              <w:t>6</w:t>
             </w:r>
             <w:r>
               <w:rPr>
@@ -549,7 +549,7 @@
               <w:rPr>
                 <w:noProof/>
               </w:rPr>
-              <w:t>4</w:t>
+              <w:t>6</w:t>
             </w:r>
             <w:r>
               <w:rPr>
@@ -610,7 +610,7 @@
               <w:rPr>
                 <w:noProof/>
               </w:rPr>
-              <w:t>4</w:t>
+              <w:t>6</w:t>
             </w:r>
             <w:r>
               <w:rPr>
@@ -671,7 +671,7 @@
               <w:rPr>
                 <w:noProof/>
               </w:rPr>
-              <w:t>4</w:t>
+              <w:t>7</w:t>
             </w:r>
             <w:r>
               <w:rPr>
@@ -732,7 +732,7 @@
               <w:rPr>
                 <w:noProof/>
               </w:rPr>
-              <w:t>4</w:t>
+              <w:t>7</w:t>
             </w:r>
             <w:r>
               <w:rPr>
@@ -793,7 +793,7 @@
               <w:rPr>
                 <w:noProof/>
               </w:rPr>
-              <w:t>5</w:t>
+              <w:t>7</w:t>
             </w:r>
             <w:r>
               <w:rPr>
@@ -854,7 +854,7 @@
               <w:rPr>
                 <w:noProof/>
               </w:rPr>
-              <w:t>5</w:t>
+              <w:t>7</w:t>
             </w:r>
             <w:r>
               <w:rPr>
@@ -915,7 +915,7 @@
               <w:rPr>
                 <w:noProof/>
               </w:rPr>
-              <w:t>5</w:t>
+              <w:t>7</w:t>
             </w:r>
             <w:r>
               <w:rPr>
@@ -976,7 +976,7 @@
               <w:rPr>
                 <w:noProof/>
               </w:rPr>
-              <w:t>5</w:t>
+              <w:t>8</w:t>
             </w:r>
             <w:r>
               <w:rPr>
@@ -1037,7 +1037,7 @@
               <w:rPr>
                 <w:noProof/>
               </w:rPr>
-              <w:t>5</w:t>
+              <w:t>8</w:t>
             </w:r>
             <w:r>
               <w:rPr>
@@ -1098,7 +1098,7 @@
               <w:rPr>
                 <w:noProof/>
               </w:rPr>
-              <w:t>6</w:t>
+              <w:t>8</w:t>
             </w:r>
             <w:r>
               <w:rPr>
@@ -1159,7 +1159,7 @@
               <w:rPr>
                 <w:noProof/>
               </w:rPr>
-              <w:t>6</w:t>
+              <w:t>9</w:t>
             </w:r>
             <w:r>
               <w:rPr>
@@ -1220,7 +1220,7 @@
               <w:rPr>
                 <w:noProof/>
               </w:rPr>
-              <w:t>6</w:t>
+              <w:t>9</w:t>
             </w:r>
             <w:r>
               <w:rPr>
@@ -1281,7 +1281,7 @@
               <w:rPr>
                 <w:noProof/>
               </w:rPr>
-              <w:t>6</w:t>
+              <w:t>9</w:t>
             </w:r>
             <w:r>
               <w:rPr>
@@ -1342,7 +1342,7 @@
               <w:rPr>
                 <w:noProof/>
               </w:rPr>
-              <w:t>6</w:t>
+              <w:t>9</w:t>
             </w:r>
             <w:r>
               <w:rPr>
@@ -1403,7 +1403,7 @@
               <w:rPr>
                 <w:noProof/>
               </w:rPr>
-              <w:t>7</w:t>
+              <w:t>10</w:t>
             </w:r>
             <w:r>
               <w:rPr>
@@ -1741,10 +1741,10 @@
         </w:rPr>
         <w:lastRenderedPageBreak/>
         <w:drawing>
-          <wp:inline distT="0" distB="0" distL="0" distR="0" wp14:anchorId="1C87A188" wp14:editId="18311D65">
-            <wp:extent cx="5654566" cy="4823012"/>
-            <wp:effectExtent l="12700" t="12700" r="10160" b="15875"/>
-            <wp:docPr id="460393522" name="Image 1"/>
+          <wp:inline distT="0" distB="0" distL="0" distR="0" wp14:anchorId="70899438" wp14:editId="32019619">
+            <wp:extent cx="5731510" cy="4863465"/>
+            <wp:effectExtent l="0" t="0" r="0" b="635"/>
+            <wp:docPr id="1578726312" name="Image 9"/>
             <wp:cNvGraphicFramePr>
               <a:graphicFrameLocks xmlns:a="http://schemas.openxmlformats.org/drawingml/2006/main" noChangeAspect="1"/>
             </wp:cNvGraphicFramePr>
@@ -1752,7 +1752,7 @@
               <a:graphicData uri="http://schemas.openxmlformats.org/drawingml/2006/picture">
                 <pic:pic xmlns:pic="http://schemas.openxmlformats.org/drawingml/2006/picture">
                   <pic:nvPicPr>
-                    <pic:cNvPr id="460393522" name="Image 460393522"/>
+                    <pic:cNvPr id="1578726312" name="Image 1578726312"/>
                     <pic:cNvPicPr/>
                   </pic:nvPicPr>
                   <pic:blipFill>
@@ -1770,16 +1770,11 @@
                   <pic:spPr>
                     <a:xfrm>
                       <a:off x="0" y="0"/>
-                      <a:ext cx="5682484" cy="4846824"/>
+                      <a:ext cx="5731510" cy="4863465"/>
                     </a:xfrm>
                     <a:prstGeom prst="rect">
                       <a:avLst/>
                     </a:prstGeom>
-                    <a:ln>
-                      <a:solidFill>
-                        <a:schemeClr val="tx1"/>
-                      </a:solidFill>
-                    </a:ln>
                   </pic:spPr>
                 </pic:pic>
               </a:graphicData>
@@ -1929,10 +1924,10 @@
         </w:rPr>
         <w:lastRenderedPageBreak/>
         <w:drawing>
-          <wp:inline distT="0" distB="0" distL="0" distR="0" wp14:anchorId="5732615F" wp14:editId="08DACDCD">
-            <wp:extent cx="5707117" cy="3692840"/>
-            <wp:effectExtent l="12700" t="12700" r="8255" b="15875"/>
-            <wp:docPr id="1467675716" name="Image 2"/>
+          <wp:inline distT="0" distB="0" distL="0" distR="0" wp14:anchorId="0F626520" wp14:editId="04BF586D">
+            <wp:extent cx="5731510" cy="4098925"/>
+            <wp:effectExtent l="0" t="0" r="0" b="3175"/>
+            <wp:docPr id="56513350" name="Image 10"/>
             <wp:cNvGraphicFramePr>
               <a:graphicFrameLocks xmlns:a="http://schemas.openxmlformats.org/drawingml/2006/main" noChangeAspect="1"/>
             </wp:cNvGraphicFramePr>
@@ -1940,7 +1935,7 @@
               <a:graphicData uri="http://schemas.openxmlformats.org/drawingml/2006/picture">
                 <pic:pic xmlns:pic="http://schemas.openxmlformats.org/drawingml/2006/picture">
                   <pic:nvPicPr>
-                    <pic:cNvPr id="1467675716" name="Image 1467675716"/>
+                    <pic:cNvPr id="56513350" name="Image 56513350"/>
                     <pic:cNvPicPr/>
                   </pic:nvPicPr>
                   <pic:blipFill>
@@ -1958,16 +1953,11 @@
                   <pic:spPr>
                     <a:xfrm>
                       <a:off x="0" y="0"/>
-                      <a:ext cx="5752383" cy="3722129"/>
+                      <a:ext cx="5731510" cy="4098925"/>
                     </a:xfrm>
                     <a:prstGeom prst="rect">
                       <a:avLst/>
                     </a:prstGeom>
-                    <a:ln>
-                      <a:solidFill>
-                        <a:schemeClr val="tx1"/>
-                      </a:solidFill>
-                    </a:ln>
                   </pic:spPr>
                 </pic:pic>
               </a:graphicData>
@@ -1994,7 +1984,16 @@
           <w:sz w:val="20"/>
           <w:szCs w:val="20"/>
         </w:rPr>
-        <w:t>Diagramme de séquence Admin</w:t>
+        <w:t xml:space="preserve">Diagramme de séquence </w:t>
+      </w:r>
+      <w:r>
+        <w:rPr>
+          <w:i/>
+          <w:iCs/>
+          <w:sz w:val="20"/>
+          <w:szCs w:val="20"/>
+        </w:rPr>
+        <w:t>Client</w:t>
       </w:r>
     </w:p>
     <w:p>
@@ -2102,24 +2101,6 @@
     </w:p>
     <w:p>
       <w:pPr>
-        <w:spacing w:before="80" w:after="80"/>
-        <w:jc w:val="center"/>
-        <w:rPr>
-          <w:i/>
-          <w:iCs/>
-          <w:sz w:val="20"/>
-          <w:szCs w:val="20"/>
-        </w:rPr>
-      </w:pPr>
-    </w:p>
-    <w:p>
-      <w:pPr>
-        <w:spacing w:before="80" w:after="80"/>
-        <w:jc w:val="center"/>
-      </w:pPr>
-    </w:p>
-    <w:p>
-      <w:pPr>
         <w:pStyle w:val="Titre2"/>
       </w:pPr>
       <w:bookmarkStart w:id="5" w:name="_Toc225407412"/>
@@ -2139,10 +2120,10 @@
           <w:noProof/>
         </w:rPr>
         <w:drawing>
-          <wp:inline distT="0" distB="0" distL="0" distR="0" wp14:anchorId="056C68E3" wp14:editId="22705A6B">
-            <wp:extent cx="4318000" cy="5461000"/>
-            <wp:effectExtent l="12700" t="12700" r="12700" b="12700"/>
-            <wp:docPr id="849738640" name="Image 4"/>
+          <wp:inline distT="0" distB="0" distL="0" distR="0" wp14:anchorId="36203F9A" wp14:editId="7A7F316C">
+            <wp:extent cx="5731510" cy="6206490"/>
+            <wp:effectExtent l="0" t="0" r="0" b="3810"/>
+            <wp:docPr id="1909681834" name="Image 8"/>
             <wp:cNvGraphicFramePr>
               <a:graphicFrameLocks xmlns:a="http://schemas.openxmlformats.org/drawingml/2006/main" noChangeAspect="1"/>
             </wp:cNvGraphicFramePr>
@@ -2150,7 +2131,7 @@
               <a:graphicData uri="http://schemas.openxmlformats.org/drawingml/2006/picture">
                 <pic:pic xmlns:pic="http://schemas.openxmlformats.org/drawingml/2006/picture">
                   <pic:nvPicPr>
-                    <pic:cNvPr id="849738640" name="Image 849738640"/>
+                    <pic:cNvPr id="1909681834" name="Image 1909681834"/>
                     <pic:cNvPicPr/>
                   </pic:nvPicPr>
                   <pic:blipFill>
@@ -2168,16 +2149,11 @@
                   <pic:spPr>
                     <a:xfrm>
                       <a:off x="0" y="0"/>
-                      <a:ext cx="4318000" cy="5461000"/>
+                      <a:ext cx="5731510" cy="6206490"/>
                     </a:xfrm>
                     <a:prstGeom prst="rect">
                       <a:avLst/>
                     </a:prstGeom>
-                    <a:ln>
-                      <a:solidFill>
-                        <a:schemeClr val="tx1"/>
-                      </a:solidFill>
-                    </a:ln>
                   </pic:spPr>
                 </pic:pic>
               </a:graphicData>
@@ -2269,21 +2245,6 @@
       <w:r>
         <w:t>Les en-têtes de colonnes ne correspondent pas toujours aux données affichées.</w:t>
       </w:r>
-    </w:p>
-    <w:p>
-      <w:pPr>
-        <w:spacing w:before="60" w:after="60"/>
-      </w:pPr>
-    </w:p>
-    <w:p>
-      <w:pPr>
-        <w:spacing w:before="60" w:after="60"/>
-      </w:pPr>
-    </w:p>
-    <w:p>
-      <w:pPr>
-        <w:spacing w:before="60" w:after="60"/>
-      </w:pPr>
     </w:p>
     <w:p>
       <w:pPr>

</xml_diff>